<commit_message>
resume: fix CSS header float, patch DOCX template to green, fix reference-doc path
</commit_message>
<xml_diff>
--- a/resume/resume-template.docx
+++ b/resume/resume-template.docx
@@ -2631,7 +2631,7 @@
     </w:pPr>
     <w:rPr>
       <w:rFonts w:asciiTheme="majorHAnsi" w:eastAsiaTheme="majorEastAsia" w:hAnsiTheme="majorHAnsi" w:cstheme="majorBidi"/>
-      <w:color w:val="2F5496" w:themeColor="accent1" w:themeShade="BF"/>
+      <w:color w:val="538135" w:themeColor="accent1" w:themeShade="BF"/>
       <w:sz w:val="40"/>
       <w:szCs w:val="40"/>
     </w:rPr>
@@ -2653,7 +2653,7 @@
     </w:pPr>
     <w:rPr>
       <w:rFonts w:asciiTheme="majorHAnsi" w:eastAsiaTheme="majorEastAsia" w:hAnsiTheme="majorHAnsi" w:cstheme="majorBidi"/>
-      <w:color w:val="2F5496" w:themeColor="accent1" w:themeShade="BF"/>
+      <w:color w:val="538135" w:themeColor="accent1" w:themeShade="BF"/>
       <w:sz w:val="32"/>
       <w:szCs w:val="32"/>
     </w:rPr>
@@ -2675,7 +2675,7 @@
     </w:pPr>
     <w:rPr>
       <w:rFonts w:eastAsiaTheme="majorEastAsia" w:cstheme="majorBidi"/>
-      <w:color w:val="2F5496" w:themeColor="accent1" w:themeShade="BF"/>
+      <w:color w:val="538135" w:themeColor="accent1" w:themeShade="BF"/>
       <w:sz w:val="28"/>
       <w:szCs w:val="28"/>
     </w:rPr>
@@ -2700,7 +2700,7 @@
       <w:rFonts w:eastAsiaTheme="majorEastAsia" w:cstheme="majorBidi"/>
       <w:i/>
       <w:iCs/>
-      <w:color w:val="2F5496" w:themeColor="accent1" w:themeShade="BF"/>
+      <w:color w:val="538135" w:themeColor="accent1" w:themeShade="BF"/>
     </w:rPr>
   </w:style>
   <w:style w:type="paragraph" w:styleId="Heading5">
@@ -2721,7 +2721,7 @@
     </w:pPr>
     <w:rPr>
       <w:rFonts w:eastAsiaTheme="majorEastAsia" w:cstheme="majorBidi"/>
-      <w:color w:val="2F5496" w:themeColor="accent1" w:themeShade="BF"/>
+      <w:color w:val="538135" w:themeColor="accent1" w:themeShade="BF"/>
     </w:rPr>
   </w:style>
   <w:style w:type="paragraph" w:styleId="Heading6">
@@ -2847,7 +2847,7 @@
     <w:rsid w:val="00043F99"/>
     <w:rPr>
       <w:rFonts w:asciiTheme="majorHAnsi" w:eastAsiaTheme="majorEastAsia" w:hAnsiTheme="majorHAnsi" w:cstheme="majorBidi"/>
-      <w:color w:val="2F5496" w:themeColor="accent1" w:themeShade="BF"/>
+      <w:color w:val="538135" w:themeColor="accent1" w:themeShade="BF"/>
       <w:sz w:val="40"/>
       <w:szCs w:val="40"/>
     </w:rPr>
@@ -2860,7 +2860,7 @@
     <w:rsid w:val="00043F99"/>
     <w:rPr>
       <w:rFonts w:asciiTheme="majorHAnsi" w:eastAsiaTheme="majorEastAsia" w:hAnsiTheme="majorHAnsi" w:cstheme="majorBidi"/>
-      <w:color w:val="2F5496" w:themeColor="accent1" w:themeShade="BF"/>
+      <w:color w:val="538135" w:themeColor="accent1" w:themeShade="BF"/>
       <w:sz w:val="32"/>
       <w:szCs w:val="32"/>
     </w:rPr>
@@ -2873,7 +2873,7 @@
     <w:rsid w:val="00043F99"/>
     <w:rPr>
       <w:rFonts w:eastAsiaTheme="majorEastAsia" w:cstheme="majorBidi"/>
-      <w:color w:val="2F5496" w:themeColor="accent1" w:themeShade="BF"/>
+      <w:color w:val="538135" w:themeColor="accent1" w:themeShade="BF"/>
       <w:sz w:val="28"/>
       <w:szCs w:val="28"/>
     </w:rPr>
@@ -2889,7 +2889,7 @@
       <w:rFonts w:eastAsiaTheme="majorEastAsia" w:cstheme="majorBidi"/>
       <w:i/>
       <w:iCs/>
-      <w:color w:val="2F5496" w:themeColor="accent1" w:themeShade="BF"/>
+      <w:color w:val="538135" w:themeColor="accent1" w:themeShade="BF"/>
     </w:rPr>
   </w:style>
   <w:style w:type="character" w:customStyle="1" w:styleId="Heading5Char">
@@ -2901,7 +2901,7 @@
     <w:rsid w:val="00043F99"/>
     <w:rPr>
       <w:rFonts w:eastAsiaTheme="majorEastAsia" w:cstheme="majorBidi"/>
-      <w:color w:val="2F5496" w:themeColor="accent1" w:themeShade="BF"/>
+      <w:color w:val="538135" w:themeColor="accent1" w:themeShade="BF"/>
     </w:rPr>
   </w:style>
   <w:style w:type="character" w:customStyle="1" w:styleId="Heading6Char">
@@ -3075,7 +3075,7 @@
     <w:rPr>
       <w:i/>
       <w:iCs/>
-      <w:color w:val="2F5496" w:themeColor="accent1" w:themeShade="BF"/>
+      <w:color w:val="538135" w:themeColor="accent1" w:themeShade="BF"/>
     </w:rPr>
   </w:style>
   <w:style w:type="paragraph" w:styleId="IntenseQuote">
@@ -3088,8 +3088,8 @@
     <w:rsid w:val="00043F99"/>
     <w:pPr>
       <w:pBdr>
-        <w:top w:val="single" w:sz="4" w:space="10" w:color="2F5496" w:themeColor="accent1" w:themeShade="BF"/>
-        <w:bottom w:val="single" w:sz="4" w:space="10" w:color="2F5496" w:themeColor="accent1" w:themeShade="BF"/>
+        <w:top w:val="single" w:sz="4" w:space="10" w:color="538135" w:themeColor="accent1" w:themeShade="BF"/>
+        <w:bottom w:val="single" w:sz="4" w:space="10" w:color="538135" w:themeColor="accent1" w:themeShade="BF"/>
       </w:pBdr>
       <w:spacing w:before="360" w:after="360"/>
       <w:ind w:left="864" w:right="864"/>
@@ -3098,7 +3098,7 @@
     <w:rPr>
       <w:i/>
       <w:iCs/>
-      <w:color w:val="2F5496" w:themeColor="accent1" w:themeShade="BF"/>
+      <w:color w:val="538135" w:themeColor="accent1" w:themeShade="BF"/>
     </w:rPr>
   </w:style>
   <w:style w:type="character" w:customStyle="1" w:styleId="IntenseQuoteChar">
@@ -3110,7 +3110,7 @@
     <w:rPr>
       <w:i/>
       <w:iCs/>
-      <w:color w:val="2F5496" w:themeColor="accent1" w:themeShade="BF"/>
+      <w:color w:val="538135" w:themeColor="accent1" w:themeShade="BF"/>
     </w:rPr>
   </w:style>
   <w:style w:type="character" w:styleId="IntenseReference">
@@ -3123,7 +3123,7 @@
       <w:b/>
       <w:bCs/>
       <w:smallCaps/>
-      <w:color w:val="2F5496" w:themeColor="accent1" w:themeShade="BF"/>
+      <w:color w:val="538135" w:themeColor="accent1" w:themeShade="BF"/>
       <w:spacing w:val="5"/>
     </w:rPr>
   </w:style>

</xml_diff>